<commit_message>
Render model subscripts properly in the manuscript
Co-Authored-By: Claude Opus 5 <noreply@anthropic.com>
</commit_message>
<xml_diff>
--- a/manuscript/Repair_Fidelity_Control_Parameter_BioEssays.docx
+++ b/manuscript/Repair_Fidelity_Control_Parameter_BioEssays.docx
@@ -32,6 +32,7 @@
       </w:pPr>
       <w:r>
         <w:rPr>
+          <w:b w:val="0"/>
           <w:i w:val="0"/>
           <w:sz w:val="22"/>
         </w:rPr>
@@ -44,6 +45,7 @@
       </w:pPr>
       <w:r>
         <w:rPr>
+          <w:b w:val="0"/>
           <w:i w:val="0"/>
           <w:sz w:val="21"/>
         </w:rPr>
@@ -56,6 +58,7 @@
       </w:pPr>
       <w:r>
         <w:rPr>
+          <w:b w:val="0"/>
           <w:i w:val="0"/>
           <w:sz w:val="21"/>
         </w:rPr>
@@ -68,6 +71,7 @@
       </w:pPr>
       <w:r>
         <w:rPr>
+          <w:b w:val="0"/>
           <w:i w:val="0"/>
           <w:sz w:val="21"/>
         </w:rPr>
@@ -92,6 +96,7 @@
       </w:pPr>
       <w:r>
         <w:rPr>
+          <w:b w:val="0"/>
           <w:i w:val="0"/>
           <w:sz w:val="22"/>
         </w:rPr>
@@ -104,6 +109,7 @@
       </w:pPr>
       <w:r>
         <w:rPr>
+          <w:b w:val="0"/>
           <w:i w:val="0"/>
           <w:sz w:val="21"/>
         </w:rPr>
@@ -128,6 +134,7 @@
       </w:pPr>
       <w:r>
         <w:rPr>
+          <w:b w:val="0"/>
           <w:i w:val="0"/>
           <w:sz w:val="22"/>
         </w:rPr>
@@ -141,6 +148,7 @@
       </w:pPr>
       <w:r>
         <w:rPr>
+          <w:b w:val="0"/>
           <w:i w:val="0"/>
           <w:sz w:val="22"/>
         </w:rPr>
@@ -154,6 +162,7 @@
       </w:pPr>
       <w:r>
         <w:rPr>
+          <w:b w:val="0"/>
           <w:i w:val="0"/>
           <w:sz w:val="22"/>
         </w:rPr>
@@ -167,6 +176,7 @@
       </w:pPr>
       <w:r>
         <w:rPr>
+          <w:b w:val="0"/>
           <w:i w:val="0"/>
           <w:sz w:val="22"/>
         </w:rPr>
@@ -180,6 +190,7 @@
       </w:pPr>
       <w:r>
         <w:rPr>
+          <w:b w:val="0"/>
           <w:i/>
           <w:color w:val="333333"/>
           <w:sz w:val="21"/>
@@ -205,6 +216,7 @@
       </w:pPr>
       <w:r>
         <w:rPr>
+          <w:b w:val="0"/>
           <w:i w:val="0"/>
           <w:sz w:val="22"/>
         </w:rPr>
@@ -218,6 +230,7 @@
       </w:pPr>
       <w:r>
         <w:rPr>
+          <w:b w:val="0"/>
           <w:i w:val="0"/>
           <w:sz w:val="22"/>
         </w:rPr>
@@ -231,6 +244,7 @@
       </w:pPr>
       <w:r>
         <w:rPr>
+          <w:b w:val="0"/>
           <w:i/>
           <w:color w:val="333333"/>
           <w:sz w:val="21"/>
@@ -256,6 +270,7 @@
       </w:pPr>
       <w:r>
         <w:rPr>
+          <w:b w:val="0"/>
           <w:i w:val="0"/>
           <w:sz w:val="22"/>
         </w:rPr>
@@ -269,6 +284,7 @@
       </w:pPr>
       <w:r>
         <w:rPr>
+          <w:b w:val="0"/>
           <w:i w:val="0"/>
           <w:sz w:val="22"/>
         </w:rPr>
@@ -282,6 +298,7 @@
       </w:pPr>
       <w:r>
         <w:rPr>
+          <w:b w:val="0"/>
           <w:i/>
           <w:color w:val="333333"/>
           <w:sz w:val="21"/>
@@ -307,6 +324,7 @@
       </w:pPr>
       <w:r>
         <w:rPr>
+          <w:b w:val="0"/>
           <w:i w:val="0"/>
           <w:sz w:val="22"/>
         </w:rPr>
@@ -377,6 +395,7 @@
       </w:pPr>
       <w:r>
         <w:rPr>
+          <w:b w:val="0"/>
           <w:i w:val="0"/>
           <w:sz w:val="22"/>
         </w:rPr>
@@ -390,6 +409,7 @@
       </w:pPr>
       <w:r>
         <w:rPr>
+          <w:b w:val="0"/>
           <w:i/>
           <w:color w:val="333333"/>
           <w:sz w:val="21"/>
@@ -415,6 +435,7 @@
       </w:pPr>
       <w:r>
         <w:rPr>
+          <w:b w:val="0"/>
           <w:i w:val="0"/>
           <w:sz w:val="22"/>
         </w:rPr>
@@ -428,6 +449,7 @@
       </w:pPr>
       <w:r>
         <w:rPr>
+          <w:b w:val="0"/>
           <w:i w:val="0"/>
           <w:sz w:val="22"/>
         </w:rPr>
@@ -440,6 +462,7 @@
       </w:pPr>
       <w:r>
         <w:rPr>
+          <w:b w:val="0"/>
           <w:i/>
           <w:sz w:val="22"/>
         </w:rPr>
@@ -452,10 +475,61 @@
       </w:pPr>
       <w:r>
         <w:rPr>
+          <w:b w:val="0"/>
           <w:i w:val="0"/>
           <w:sz w:val="22"/>
         </w:rPr>
-        <w:t>with self-amplifying repair μ(I) = μ₀(1 + βs(I)), s(I) = Iʰ/(Kʰ + Iʰ), and an erosion flux ρ = ρ₀ + ρ_stress·D + ρ_damage·N, where ρ₀ is baseline turnover, D is genotoxic or environmental stress and N is any accumulating burden of unrepaired lesions or pathological tissue. Repair is self-amplifying because intact, well-organised tissue supports its own maintenance machinery better than eroded tissue does. Positive feedback of this form is the standard route to bistability in cell-biological systems (Ferrell 2002), and the model inherits that behaviour by construction rather than discovering it.</w:t>
+        <w:t xml:space="preserve">with self-amplifying repair μ(I) = μ₀(1 + βs(I)), s(I) = Iʰ/(Kʰ + Iʰ), and an erosion flux ρ = ρ₀ + </w:t>
+      </w:r>
+      <w:r>
+        <w:rPr>
+          <w:b w:val="0"/>
+          <w:i w:val="0"/>
+          <w:sz w:val="22"/>
+        </w:rPr>
+        <w:t>ρ</w:t>
+      </w:r>
+      <w:r>
+        <w:rPr>
+          <w:b w:val="0"/>
+          <w:i w:val="0"/>
+          <w:sz w:val="22"/>
+          <w:vertAlign w:val="subscript"/>
+        </w:rPr>
+        <w:t>stress</w:t>
+      </w:r>
+      <w:r>
+        <w:rPr>
+          <w:b w:val="0"/>
+          <w:i w:val="0"/>
+          <w:sz w:val="22"/>
+        </w:rPr>
+        <w:t xml:space="preserve">·D + </w:t>
+      </w:r>
+      <w:r>
+        <w:rPr>
+          <w:b w:val="0"/>
+          <w:i w:val="0"/>
+          <w:sz w:val="22"/>
+        </w:rPr>
+        <w:t>ρ</w:t>
+      </w:r>
+      <w:r>
+        <w:rPr>
+          <w:b w:val="0"/>
+          <w:i w:val="0"/>
+          <w:sz w:val="22"/>
+          <w:vertAlign w:val="subscript"/>
+        </w:rPr>
+        <w:t>damage</w:t>
+      </w:r>
+      <w:r>
+        <w:rPr>
+          <w:b w:val="0"/>
+          <w:i w:val="0"/>
+          <w:sz w:val="22"/>
+        </w:rPr>
+        <w:t>·N, where ρ₀ is baseline turnover, D is genotoxic or environmental stress and N is any accumulating burden of unrepaired lesions or pathological tissue. Repair is self-amplifying because intact, well-organised tissue supports its own maintenance machinery better than eroded tissue does. Positive feedback of this form is the standard route to bistability in cell-biological systems (Ferrell 2002), and the model inherits that behaviour by construction rather than discovering it.</w:t>
       </w:r>
     </w:p>
     <w:p>
@@ -465,6 +539,7 @@
       </w:pPr>
       <w:r>
         <w:rPr>
+          <w:b w:val="0"/>
           <w:i w:val="0"/>
           <w:sz w:val="22"/>
         </w:rPr>
@@ -516,9 +591,36 @@
       </w:pPr>
       <w:r>
         <w:rPr>
+          <w:b w:val="0"/>
+          <w:i w:val="0"/>
           <w:sz w:val="19"/>
         </w:rPr>
-        <w:t>Figure 1. The order–repair model is bistable and hysteretic by construction. (A) Repair that reinforces tissue order, compared with a constant baseline rate. (B) The resulting equilibrium curve is S-shaped: between ρ = 0.51 and ρ = 0.71 a high-order and a low-order state are simultaneously stable, separated by an unstable branch. The fold at ρ_c = 0.71 is the tipping point. (C) Integrating the dynamics under rising and then falling stress traces a hysteresis loop: collapse and recovery occur at different stress levels. These are properties of the assumed feedback, not fitted results.</w:t>
+        <w:t xml:space="preserve">Figure 1. The order–repair model is bistable and hysteretic by construction. (A) Repair that reinforces tissue order, compared with a constant baseline rate. (B) The resulting equilibrium curve is S-shaped: between ρ = 0.51 and ρ = 0.71 a high-order and a low-order state are simultaneously stable, separated by an unstable branch. The fold at </w:t>
+      </w:r>
+      <w:r>
+        <w:rPr>
+          <w:b w:val="0"/>
+          <w:i w:val="0"/>
+          <w:sz w:val="19"/>
+        </w:rPr>
+        <w:t>ρ</w:t>
+      </w:r>
+      <w:r>
+        <w:rPr>
+          <w:b w:val="0"/>
+          <w:i w:val="0"/>
+          <w:sz w:val="19"/>
+          <w:vertAlign w:val="subscript"/>
+        </w:rPr>
+        <w:t>c</w:t>
+      </w:r>
+      <w:r>
+        <w:rPr>
+          <w:b w:val="0"/>
+          <w:i w:val="0"/>
+          <w:sz w:val="19"/>
+        </w:rPr>
+        <w:t xml:space="preserve"> = 0.71 is the tipping point. (C) Integrating the dynamics under rising and then falling stress traces a hysteresis loop: collapse and recovery occur at different stress levels. These are properties of the assumed feedback, not fitted results.</w:t>
       </w:r>
     </w:p>
     <w:p>
@@ -528,6 +630,7 @@
       </w:pPr>
       <w:r>
         <w:rPr>
+          <w:b w:val="0"/>
           <w:i/>
           <w:color w:val="333333"/>
           <w:sz w:val="21"/>
@@ -553,10 +656,36 @@
       </w:pPr>
       <w:r>
         <w:rPr>
+          <w:b w:val="0"/>
           <w:i w:val="0"/>
           <w:sz w:val="22"/>
         </w:rPr>
-        <w:t>We represent an organism-wide difference in repair fidelity as a multiplier α on the repair function. The question is how the tipping point ρ_c — the erosion flux beyond which no amount of tissue self-repair prevents reversion — depends on α.</w:t>
+        <w:t xml:space="preserve">We represent an organism-wide difference in repair fidelity as a multiplier α on the repair function. The question is how the tipping point </w:t>
+      </w:r>
+      <w:r>
+        <w:rPr>
+          <w:b w:val="0"/>
+          <w:i w:val="0"/>
+          <w:sz w:val="22"/>
+        </w:rPr>
+        <w:t>ρ</w:t>
+      </w:r>
+      <w:r>
+        <w:rPr>
+          <w:b w:val="0"/>
+          <w:i w:val="0"/>
+          <w:sz w:val="22"/>
+          <w:vertAlign w:val="subscript"/>
+        </w:rPr>
+        <w:t>c</w:t>
+      </w:r>
+      <w:r>
+        <w:rPr>
+          <w:b w:val="0"/>
+          <w:i w:val="0"/>
+          <w:sz w:val="22"/>
+        </w:rPr>
+        <w:t xml:space="preserve"> — the erosion flux beyond which no amount of tissue self-repair prevents reversion — depends on α.</w:t>
       </w:r>
     </w:p>
     <w:p>
@@ -566,10 +695,111 @@
       </w:pPr>
       <w:r>
         <w:rPr>
+          <w:b w:val="0"/>
           <w:i w:val="0"/>
           <w:sz w:val="22"/>
         </w:rPr>
-        <w:t>When α scales repair uniformly, μ_α(I) = αμ(I), the answer is exact. Both μ and μ′ carry the same factor, so it cancels from the fold condition entirely: the fold sits at the same tissue order I_c for every α, and ρ_c is precisely proportional to α. Computing ρ_c independently at 64 values of α between 0.25 and 8 confirms this, with ρ_c/α constant to a relative deviation of 3e-16 and the fold position varying by 1e-16 — both at machine precision (Fig. 2). Doubling repair fidelity doubles the stress a tissue can absorb before it collapses, and this holds for every value of μ₀, β, K and h.</w:t>
+        <w:t xml:space="preserve">When α scales repair uniformly, μ_α(I) = αμ(I), the answer is exact. Both μ and μ′ carry the same factor, so it cancels from the fold condition entirely: the fold sits at the same tissue order </w:t>
+      </w:r>
+      <w:r>
+        <w:rPr>
+          <w:b w:val="0"/>
+          <w:i w:val="0"/>
+          <w:sz w:val="22"/>
+        </w:rPr>
+        <w:t>I</w:t>
+      </w:r>
+      <w:r>
+        <w:rPr>
+          <w:b w:val="0"/>
+          <w:i w:val="0"/>
+          <w:sz w:val="22"/>
+          <w:vertAlign w:val="subscript"/>
+        </w:rPr>
+        <w:t>c</w:t>
+      </w:r>
+      <w:r>
+        <w:rPr>
+          <w:b w:val="0"/>
+          <w:i w:val="0"/>
+          <w:sz w:val="22"/>
+        </w:rPr>
+        <w:t xml:space="preserve"> for every α, and </w:t>
+      </w:r>
+      <w:r>
+        <w:rPr>
+          <w:b w:val="0"/>
+          <w:i w:val="0"/>
+          <w:sz w:val="22"/>
+        </w:rPr>
+        <w:t>ρ</w:t>
+      </w:r>
+      <w:r>
+        <w:rPr>
+          <w:b w:val="0"/>
+          <w:i w:val="0"/>
+          <w:sz w:val="22"/>
+          <w:vertAlign w:val="subscript"/>
+        </w:rPr>
+        <w:t>c</w:t>
+      </w:r>
+      <w:r>
+        <w:rPr>
+          <w:b w:val="0"/>
+          <w:i w:val="0"/>
+          <w:sz w:val="22"/>
+        </w:rPr>
+        <w:t xml:space="preserve"> is precisely proportional to α. Computing </w:t>
+      </w:r>
+      <w:r>
+        <w:rPr>
+          <w:b w:val="0"/>
+          <w:i w:val="0"/>
+          <w:sz w:val="22"/>
+        </w:rPr>
+        <w:t>ρ</w:t>
+      </w:r>
+      <w:r>
+        <w:rPr>
+          <w:b w:val="0"/>
+          <w:i w:val="0"/>
+          <w:sz w:val="22"/>
+          <w:vertAlign w:val="subscript"/>
+        </w:rPr>
+        <w:t>c</w:t>
+      </w:r>
+      <w:r>
+        <w:rPr>
+          <w:b w:val="0"/>
+          <w:i w:val="0"/>
+          <w:sz w:val="22"/>
+        </w:rPr>
+        <w:t xml:space="preserve"> independently at 64 values of α between 0.25 and 8 confirms this, with </w:t>
+      </w:r>
+      <w:r>
+        <w:rPr>
+          <w:b w:val="0"/>
+          <w:i w:val="0"/>
+          <w:sz w:val="22"/>
+        </w:rPr>
+        <w:t>ρ</w:t>
+      </w:r>
+      <w:r>
+        <w:rPr>
+          <w:b w:val="0"/>
+          <w:i w:val="0"/>
+          <w:sz w:val="22"/>
+          <w:vertAlign w:val="subscript"/>
+        </w:rPr>
+        <w:t>c</w:t>
+      </w:r>
+      <w:r>
+        <w:rPr>
+          <w:b w:val="0"/>
+          <w:i w:val="0"/>
+          <w:sz w:val="22"/>
+        </w:rPr>
+        <w:t>/α constant to a relative deviation of 3e-16 and the fold position varying by 1e-16 — both at machine precision (Fig. 2). Doubling repair fidelity doubles the stress a tissue can absorb before it collapses, and this holds for every value of μ₀, β, K and h.</w:t>
       </w:r>
     </w:p>
     <w:p>
@@ -579,6 +809,7 @@
       </w:pPr>
       <w:r>
         <w:rPr>
+          <w:b w:val="0"/>
           <w:i w:val="0"/>
           <w:sz w:val="22"/>
         </w:rPr>
@@ -630,9 +861,86 @@
       </w:pPr>
       <w:r>
         <w:rPr>
+          <w:b w:val="0"/>
+          <w:i w:val="0"/>
           <w:sz w:val="19"/>
         </w:rPr>
-        <w:t>Figure 2. Repair fidelity scales the tipping point. (A) Stable (solid) and unstable (dotted) equilibrium branches for repair multipliers α = 0.5, 1, 2 and 4. Filled circles mark the fold. The folds slide to higher erosion flux while remaining at the same tissue order I_c = 0.47. (B) The tipping point computed at 64 values of α lies on the line ρ_c = α·ρ_c(1) to within 3e-16. The scaling is exact, not fitted.</w:t>
+        <w:t xml:space="preserve">Figure 2. Repair fidelity scales the tipping point. (A) Stable (solid) and unstable (dotted) equilibrium branches for repair multipliers α = 0.5, 1, 2 and 4. Filled circles mark the fold. The folds slide to higher erosion flux while remaining at the same tissue order </w:t>
+      </w:r>
+      <w:r>
+        <w:rPr>
+          <w:b w:val="0"/>
+          <w:i w:val="0"/>
+          <w:sz w:val="19"/>
+        </w:rPr>
+        <w:t>I</w:t>
+      </w:r>
+      <w:r>
+        <w:rPr>
+          <w:b w:val="0"/>
+          <w:i w:val="0"/>
+          <w:sz w:val="19"/>
+          <w:vertAlign w:val="subscript"/>
+        </w:rPr>
+        <w:t>c</w:t>
+      </w:r>
+      <w:r>
+        <w:rPr>
+          <w:b w:val="0"/>
+          <w:i w:val="0"/>
+          <w:sz w:val="19"/>
+        </w:rPr>
+        <w:t xml:space="preserve"> = 0.47. (B) The tipping point computed at 64 values of α lies on the line </w:t>
+      </w:r>
+      <w:r>
+        <w:rPr>
+          <w:b w:val="0"/>
+          <w:i w:val="0"/>
+          <w:sz w:val="19"/>
+        </w:rPr>
+        <w:t>ρ</w:t>
+      </w:r>
+      <w:r>
+        <w:rPr>
+          <w:b w:val="0"/>
+          <w:i w:val="0"/>
+          <w:sz w:val="19"/>
+          <w:vertAlign w:val="subscript"/>
+        </w:rPr>
+        <w:t>c</w:t>
+      </w:r>
+      <w:r>
+        <w:rPr>
+          <w:b w:val="0"/>
+          <w:i w:val="0"/>
+          <w:sz w:val="19"/>
+        </w:rPr>
+        <w:t xml:space="preserve"> = α·</w:t>
+      </w:r>
+      <w:r>
+        <w:rPr>
+          <w:b w:val="0"/>
+          <w:i w:val="0"/>
+          <w:sz w:val="19"/>
+        </w:rPr>
+        <w:t>ρ</w:t>
+      </w:r>
+      <w:r>
+        <w:rPr>
+          <w:b w:val="0"/>
+          <w:i w:val="0"/>
+          <w:sz w:val="19"/>
+          <w:vertAlign w:val="subscript"/>
+        </w:rPr>
+        <w:t>c</w:t>
+      </w:r>
+      <w:r>
+        <w:rPr>
+          <w:b w:val="0"/>
+          <w:i w:val="0"/>
+          <w:sz w:val="19"/>
+        </w:rPr>
+        <w:t>(1) to within 3e-16. The scaling is exact, not fitted.</w:t>
       </w:r>
     </w:p>
     <w:p>
@@ -642,11 +950,68 @@
       </w:pPr>
       <w:r>
         <w:rPr>
+          <w:b w:val="0"/>
           <w:i/>
           <w:color w:val="333333"/>
           <w:sz w:val="21"/>
         </w:rPr>
-        <w:t>Under uniform scaling, ρ_c = α·ρ_c(1) exactly: repair fidelity is a control parameter for the stability of the multicellular state, not an incremental improvement to one defence.</w:t>
+        <w:t xml:space="preserve">Under uniform scaling, </w:t>
+      </w:r>
+      <w:r>
+        <w:rPr>
+          <w:b w:val="0"/>
+          <w:i/>
+          <w:color w:val="333333"/>
+          <w:sz w:val="21"/>
+        </w:rPr>
+        <w:t>ρ</w:t>
+      </w:r>
+      <w:r>
+        <w:rPr>
+          <w:b w:val="0"/>
+          <w:i/>
+          <w:color w:val="333333"/>
+          <w:sz w:val="21"/>
+          <w:vertAlign w:val="subscript"/>
+        </w:rPr>
+        <w:t>c</w:t>
+      </w:r>
+      <w:r>
+        <w:rPr>
+          <w:b w:val="0"/>
+          <w:i/>
+          <w:color w:val="333333"/>
+          <w:sz w:val="21"/>
+        </w:rPr>
+        <w:t xml:space="preserve"> = α·</w:t>
+      </w:r>
+      <w:r>
+        <w:rPr>
+          <w:b w:val="0"/>
+          <w:i/>
+          <w:color w:val="333333"/>
+          <w:sz w:val="21"/>
+        </w:rPr>
+        <w:t>ρ</w:t>
+      </w:r>
+      <w:r>
+        <w:rPr>
+          <w:b w:val="0"/>
+          <w:i/>
+          <w:color w:val="333333"/>
+          <w:sz w:val="21"/>
+          <w:vertAlign w:val="subscript"/>
+        </w:rPr>
+        <w:t>c</w:t>
+      </w:r>
+      <w:r>
+        <w:rPr>
+          <w:b w:val="0"/>
+          <w:i/>
+          <w:color w:val="333333"/>
+          <w:sz w:val="21"/>
+        </w:rPr>
+        <w:t>(1) exactly: repair fidelity is a control parameter for the stability of the multicellular state, not an incremental improvement to one defence.</w:t>
       </w:r>
     </w:p>
     <w:p>
@@ -667,6 +1032,7 @@
       </w:pPr>
       <w:r>
         <w:rPr>
+          <w:b w:val="0"/>
           <w:i w:val="0"/>
           <w:sz w:val="22"/>
         </w:rPr>
@@ -737,10 +1103,61 @@
       </w:pPr>
       <w:r>
         <w:rPr>
+          <w:b w:val="0"/>
           <w:i w:val="0"/>
           <w:sz w:val="22"/>
         </w:rPr>
-        <w:t>All three raise the tipping point, and they do so in every one of the 17,583 randomly drawn parameter sets that were bistable at baseline: the fraction with ρ_c(α=2) &gt; ρ_c(α=1) is 100%% in each case. The direction of the effect is therefore robust, and does not depend on the particular functional form.</w:t>
+        <w:t xml:space="preserve">All three raise the tipping point, and they do so in every one of the 17,583 randomly drawn parameter sets that were bistable at baseline: the fraction with </w:t>
+      </w:r>
+      <w:r>
+        <w:rPr>
+          <w:b w:val="0"/>
+          <w:i w:val="0"/>
+          <w:sz w:val="22"/>
+        </w:rPr>
+        <w:t>ρ</w:t>
+      </w:r>
+      <w:r>
+        <w:rPr>
+          <w:b w:val="0"/>
+          <w:i w:val="0"/>
+          <w:sz w:val="22"/>
+          <w:vertAlign w:val="subscript"/>
+        </w:rPr>
+        <w:t>c</w:t>
+      </w:r>
+      <w:r>
+        <w:rPr>
+          <w:b w:val="0"/>
+          <w:i w:val="0"/>
+          <w:sz w:val="22"/>
+        </w:rPr>
+        <w:t xml:space="preserve">(α=2) &gt; </w:t>
+      </w:r>
+      <w:r>
+        <w:rPr>
+          <w:b w:val="0"/>
+          <w:i w:val="0"/>
+          <w:sz w:val="22"/>
+        </w:rPr>
+        <w:t>ρ</w:t>
+      </w:r>
+      <w:r>
+        <w:rPr>
+          <w:b w:val="0"/>
+          <w:i w:val="0"/>
+          <w:sz w:val="22"/>
+          <w:vertAlign w:val="subscript"/>
+        </w:rPr>
+        <w:t>c</w:t>
+      </w:r>
+      <w:r>
+        <w:rPr>
+          <w:b w:val="0"/>
+          <w:i w:val="0"/>
+          <w:sz w:val="22"/>
+        </w:rPr>
+        <w:t>(α=1) is 100%% in each case. The direction of the effect is therefore robust, and does not depend on the particular functional form.</w:t>
       </w:r>
     </w:p>
     <w:p>
@@ -750,10 +1167,36 @@
       </w:pPr>
       <w:r>
         <w:rPr>
+          <w:b w:val="0"/>
           <w:i w:val="0"/>
           <w:sz w:val="22"/>
         </w:rPr>
-        <w:t>The magnitude is not. Doubling α multiplies ρ_c by 2.00 under uniform scaling, 1.89 under feedback-only enhancement, but only 1.10 under constitutive-only enhancement (medians across the same parameter sets). More strikingly, constitutive-only enhancement destroys the bistability altogether above α = 2.60 at the baseline parameters: the two folds annihilate in a cusp, ρ(I) becomes monotone, and the tissue's response to stress changes character — from an all-or-nothing collapse to a graded decline with no threshold at all (Fig. 3).</w:t>
+        <w:t xml:space="preserve">The magnitude is not. Doubling α multiplies </w:t>
+      </w:r>
+      <w:r>
+        <w:rPr>
+          <w:b w:val="0"/>
+          <w:i w:val="0"/>
+          <w:sz w:val="22"/>
+        </w:rPr>
+        <w:t>ρ</w:t>
+      </w:r>
+      <w:r>
+        <w:rPr>
+          <w:b w:val="0"/>
+          <w:i w:val="0"/>
+          <w:sz w:val="22"/>
+          <w:vertAlign w:val="subscript"/>
+        </w:rPr>
+        <w:t>c</w:t>
+      </w:r>
+      <w:r>
+        <w:rPr>
+          <w:b w:val="0"/>
+          <w:i w:val="0"/>
+          <w:sz w:val="22"/>
+        </w:rPr>
+        <w:t xml:space="preserve"> by 2.00 under uniform scaling, 1.89 under feedback-only enhancement, but only 1.10 under constitutive-only enhancement (medians across the same parameter sets). More strikingly, constitutive-only enhancement destroys the bistability altogether above α = 2.60 at the baseline parameters: the two folds annihilate in a cusp, ρ(I) becomes monotone, and the tissue's response to stress changes character — from an all-or-nothing collapse to a graded decline with no threshold at all (Fig. 3).</w:t>
       </w:r>
     </w:p>
     <w:p>
@@ -763,6 +1206,7 @@
       </w:pPr>
       <w:r>
         <w:rPr>
+          <w:b w:val="0"/>
           <w:i w:val="0"/>
           <w:sz w:val="22"/>
         </w:rPr>
@@ -814,9 +1258,86 @@
       </w:pPr>
       <w:r>
         <w:rPr>
+          <w:b w:val="0"/>
+          <w:i w:val="0"/>
           <w:sz w:val="19"/>
         </w:rPr>
-        <w:t>Figure 3. The three implementations agree on direction and disagree on magnitude. (A) Tipping point against repair multiplier for each implementation. Uniform and feedback-only scaling raise ρ_c steadily; constitutive-only scaling raises it weakly and then loses bistability entirely above α = 2.60, where the folds annihilate and the stress response becomes graded. (B) Ratio ρ_c(α=2)/ρ_c(α=1) across 17,583 randomly drawn bistable parameter sets; bars are medians, whiskers the 5th–95th percentiles. The effect is positive in every sampled set under all three implementations.</w:t>
+        <w:t xml:space="preserve">Figure 3. The three implementations agree on direction and disagree on magnitude. (A) Tipping point against repair multiplier for each implementation. Uniform and feedback-only scaling raise </w:t>
+      </w:r>
+      <w:r>
+        <w:rPr>
+          <w:b w:val="0"/>
+          <w:i w:val="0"/>
+          <w:sz w:val="19"/>
+        </w:rPr>
+        <w:t>ρ</w:t>
+      </w:r>
+      <w:r>
+        <w:rPr>
+          <w:b w:val="0"/>
+          <w:i w:val="0"/>
+          <w:sz w:val="19"/>
+          <w:vertAlign w:val="subscript"/>
+        </w:rPr>
+        <w:t>c</w:t>
+      </w:r>
+      <w:r>
+        <w:rPr>
+          <w:b w:val="0"/>
+          <w:i w:val="0"/>
+          <w:sz w:val="19"/>
+        </w:rPr>
+        <w:t xml:space="preserve"> steadily; constitutive-only scaling raises it weakly and then loses bistability entirely above α = 2.60, where the folds annihilate and the stress response becomes graded. (B) Ratio </w:t>
+      </w:r>
+      <w:r>
+        <w:rPr>
+          <w:b w:val="0"/>
+          <w:i w:val="0"/>
+          <w:sz w:val="19"/>
+        </w:rPr>
+        <w:t>ρ</w:t>
+      </w:r>
+      <w:r>
+        <w:rPr>
+          <w:b w:val="0"/>
+          <w:i w:val="0"/>
+          <w:sz w:val="19"/>
+          <w:vertAlign w:val="subscript"/>
+        </w:rPr>
+        <w:t>c</w:t>
+      </w:r>
+      <w:r>
+        <w:rPr>
+          <w:b w:val="0"/>
+          <w:i w:val="0"/>
+          <w:sz w:val="19"/>
+        </w:rPr>
+        <w:t>(α=2)/</w:t>
+      </w:r>
+      <w:r>
+        <w:rPr>
+          <w:b w:val="0"/>
+          <w:i w:val="0"/>
+          <w:sz w:val="19"/>
+        </w:rPr>
+        <w:t>ρ</w:t>
+      </w:r>
+      <w:r>
+        <w:rPr>
+          <w:b w:val="0"/>
+          <w:i w:val="0"/>
+          <w:sz w:val="19"/>
+          <w:vertAlign w:val="subscript"/>
+        </w:rPr>
+        <w:t>c</w:t>
+      </w:r>
+      <w:r>
+        <w:rPr>
+          <w:b w:val="0"/>
+          <w:i w:val="0"/>
+          <w:sz w:val="19"/>
+        </w:rPr>
+        <w:t>(α=1) across 17,583 randomly drawn bistable parameter sets; bars are medians, whiskers the 5th–95th percentiles. The effect is positive in every sampled set under all three implementations.</w:t>
       </w:r>
     </w:p>
     <w:p>
@@ -826,6 +1347,7 @@
       </w:pPr>
       <w:r>
         <w:rPr>
+          <w:b w:val="0"/>
           <w:i/>
           <w:color w:val="333333"/>
           <w:sz w:val="21"/>
@@ -851,6 +1373,7 @@
       </w:pPr>
       <w:r>
         <w:rPr>
+          <w:b w:val="0"/>
           <w:i w:val="0"/>
           <w:sz w:val="22"/>
         </w:rPr>
@@ -936,6 +1459,8 @@
             <w:r/>
             <w:r>
               <w:rPr>
+                <w:b w:val="0"/>
+                <w:i w:val="0"/>
                 <w:sz w:val="18"/>
               </w:rPr>
               <w:t>Bowhead fibroblasts show enhanced double-strand-break repair capacity and fidelity, and lower mutation rates, than human or other mammalian cells (Firsanov et al. 2025).</w:t>
@@ -953,6 +1478,8 @@
             <w:r/>
             <w:r>
               <w:rPr>
+                <w:b w:val="0"/>
+                <w:i w:val="0"/>
                 <w:sz w:val="18"/>
               </w:rPr>
               <w:t>High constitutive repair fidelity can occur in a long-lived, large-bodied mammal without additional tumour-suppressor barriers.</w:t>
@@ -970,6 +1497,8 @@
             <w:r/>
             <w:r>
               <w:rPr>
+                <w:b w:val="0"/>
+                <w:i w:val="0"/>
                 <w:sz w:val="18"/>
               </w:rPr>
               <w:t>Raising repair fidelity in other species or cell types should shift the modelled tissue toward a more stable high-order state (P1–P2).</w:t>
@@ -989,6 +1518,8 @@
             <w:r/>
             <w:r>
               <w:rPr>
+                <w:b w:val="0"/>
+                <w:i w:val="0"/>
                 <w:sz w:val="18"/>
               </w:rPr>
               <w:t>Bowhead CIRBP raises non-homologous end-joining and homologous-recombination efficiency when expressed in human cells (Firsanov et al. 2025).</w:t>
@@ -1006,6 +1537,8 @@
             <w:r/>
             <w:r>
               <w:rPr>
+                <w:b w:val="0"/>
+                <w:i w:val="0"/>
                 <w:sz w:val="18"/>
               </w:rPr>
               <w:t>CIRBP can act as a transferable repair-fidelity effector rather than a bowhead-specific curiosity.</w:t>
@@ -1023,6 +1556,8 @@
             <w:r/>
             <w:r>
               <w:rPr>
+                <w:b w:val="0"/>
+                <w:i w:val="0"/>
                 <w:sz w:val="18"/>
               </w:rPr>
               <w:t>CIRBP enhancement in other human or mouse cell types should measurably raise genotoxic-stress thresholds (P1–P2).</w:t>
@@ -1042,6 +1577,8 @@
             <w:r/>
             <w:r>
               <w:rPr>
+                <w:b w:val="0"/>
+                <w:i w:val="0"/>
                 <w:sz w:val="18"/>
               </w:rPr>
               <w:t>CIRBP overexpression extends lifespan and radiation resistance in Drosophila (Firsanov et al. 2025).</w:t>
@@ -1059,6 +1596,8 @@
             <w:r/>
             <w:r>
               <w:rPr>
+                <w:b w:val="0"/>
+                <w:i w:val="0"/>
                 <w:sz w:val="18"/>
               </w:rPr>
               <w:t>One repair-fidelity effector can influence both damage resistance and organismal longevity in at least one model organism.</w:t>
@@ -1076,6 +1615,8 @@
             <w:r/>
             <w:r>
               <w:rPr>
+                <w:b w:val="0"/>
+                <w:i w:val="0"/>
                 <w:sz w:val="18"/>
               </w:rPr>
               <w:t>Repair-fidelity enhancement should couple cancer-relevant and ageing-relevant readouts in other systems (P5).</w:t>
@@ -1095,6 +1636,8 @@
             <w:r/>
             <w:r>
               <w:rPr>
+                <w:b w:val="0"/>
+                <w:i w:val="0"/>
                 <w:sz w:val="18"/>
               </w:rPr>
               <w:t>The present order–repair model.</w:t>
@@ -1112,9 +1655,36 @@
             <w:r/>
             <w:r>
               <w:rPr>
+                <w:b w:val="0"/>
+                <w:i w:val="0"/>
                 <w:sz w:val="18"/>
               </w:rPr>
-              <w:t>Uniform repair scaling raises the erosion threshold ρ_c exactly in proportion to α; the implementation determines the magnitude and can abolish the threshold.</w:t>
+              <w:t xml:space="preserve">Uniform repair scaling raises the erosion threshold </w:t>
+            </w:r>
+            <w:r>
+              <w:rPr>
+                <w:b w:val="0"/>
+                <w:i w:val="0"/>
+                <w:sz w:val="18"/>
+              </w:rPr>
+              <w:t>ρ</w:t>
+            </w:r>
+            <w:r>
+              <w:rPr>
+                <w:b w:val="0"/>
+                <w:i w:val="0"/>
+                <w:sz w:val="18"/>
+                <w:vertAlign w:val="subscript"/>
+              </w:rPr>
+              <w:t>c</w:t>
+            </w:r>
+            <w:r>
+              <w:rPr>
+                <w:b w:val="0"/>
+                <w:i w:val="0"/>
+                <w:sz w:val="18"/>
+              </w:rPr>
+              <w:t xml:space="preserve"> exactly in proportion to α; the implementation determines the magnitude and can abolish the threshold.</w:t>
             </w:r>
           </w:p>
         </w:tc>
@@ -1129,6 +1699,8 @@
             <w:r/>
             <w:r>
               <w:rPr>
+                <w:b w:val="0"/>
+                <w:i w:val="0"/>
                 <w:sz w:val="18"/>
               </w:rPr>
               <w:t>Repair-fidelity enhancement should shift measurable tissue-level stress thresholds, and the size of the shift should identify which implementation operates (P3–P4).</w:t>
@@ -1143,6 +1715,8 @@
       </w:pPr>
       <w:r>
         <w:rPr>
+          <w:b w:val="0"/>
+          <w:i w:val="0"/>
           <w:sz w:val="19"/>
         </w:rPr>
         <w:t>Table 1. Evidence, interpretation and test. Only the final row is specific to the present model; the first three summarise Firsanov et al. (2025).</w:t>
@@ -1155,6 +1729,7 @@
       </w:pPr>
       <w:r>
         <w:rPr>
+          <w:b w:val="0"/>
           <w:i/>
           <w:color w:val="333333"/>
           <w:sz w:val="21"/>
@@ -1180,6 +1755,7 @@
       </w:pPr>
       <w:r>
         <w:rPr>
+          <w:b w:val="0"/>
           <w:i w:val="0"/>
           <w:sz w:val="22"/>
         </w:rPr>
@@ -1205,6 +1781,7 @@
       </w:pPr>
       <w:r>
         <w:rPr>
+          <w:b w:val="0"/>
           <w:i w:val="0"/>
           <w:sz w:val="22"/>
         </w:rPr>
@@ -1218,6 +1795,7 @@
       </w:pPr>
       <w:r>
         <w:rPr>
+          <w:b w:val="0"/>
           <w:i/>
           <w:color w:val="333333"/>
           <w:sz w:val="21"/>
@@ -1243,6 +1821,7 @@
       </w:pPr>
       <w:r>
         <w:rPr>
+          <w:b w:val="0"/>
           <w:i w:val="0"/>
           <w:sz w:val="22"/>
         </w:rPr>
@@ -1346,6 +1925,7 @@
       </w:pPr>
       <w:r>
         <w:rPr>
+          <w:b w:val="0"/>
           <w:i w:val="0"/>
           <w:sz w:val="22"/>
         </w:rPr>
@@ -1359,6 +1939,7 @@
       </w:pPr>
       <w:r>
         <w:rPr>
+          <w:b w:val="0"/>
           <w:i/>
           <w:color w:val="333333"/>
           <w:sz w:val="21"/>
@@ -1384,6 +1965,7 @@
       </w:pPr>
       <w:r>
         <w:rPr>
+          <w:b w:val="0"/>
           <w:i w:val="0"/>
           <w:sz w:val="22"/>
         </w:rPr>
@@ -1397,10 +1979,36 @@
       </w:pPr>
       <w:r>
         <w:rPr>
+          <w:b w:val="0"/>
           <w:i w:val="0"/>
           <w:sz w:val="22"/>
         </w:rPr>
-        <w:t>A note on therapeutic implications, which this paper deliberately does not develop. If repair fidelity is a system-level determinant of tissue stability, interventions that raise it would act on ρ_c, whereas tumour-directed therapies — including adaptive strategies that manage a tumour population rather than maximising cell kill (Gatenby et al. 2009) — act on ρ. These are different terms of the same equation, which suggests complementarity rather than competition. We state this and stop there: the hypothesis stands or falls as basic biology, and the therapeutic question involves risks addressed in the next section.</w:t>
+        <w:t xml:space="preserve">A note on therapeutic implications, which this paper deliberately does not develop. If repair fidelity is a system-level determinant of tissue stability, interventions that raise it would act on </w:t>
+      </w:r>
+      <w:r>
+        <w:rPr>
+          <w:b w:val="0"/>
+          <w:i w:val="0"/>
+          <w:sz w:val="22"/>
+        </w:rPr>
+        <w:t>ρ</w:t>
+      </w:r>
+      <w:r>
+        <w:rPr>
+          <w:b w:val="0"/>
+          <w:i w:val="0"/>
+          <w:sz w:val="22"/>
+          <w:vertAlign w:val="subscript"/>
+        </w:rPr>
+        <w:t>c</w:t>
+      </w:r>
+      <w:r>
+        <w:rPr>
+          <w:b w:val="0"/>
+          <w:i w:val="0"/>
+          <w:sz w:val="22"/>
+        </w:rPr>
+        <w:t>, whereas tumour-directed therapies — including adaptive strategies that manage a tumour population rather than maximising cell kill (Gatenby et al. 2009) — act on ρ. These are different terms of the same equation, which suggests complementarity rather than competition. We state this and stop there: the hypothesis stands or falls as basic biology, and the therapeutic question involves risks addressed in the next section.</w:t>
       </w:r>
     </w:p>
     <w:p>
@@ -1410,6 +2018,7 @@
       </w:pPr>
       <w:r>
         <w:rPr>
+          <w:b w:val="0"/>
           <w:i/>
           <w:color w:val="333333"/>
           <w:sz w:val="21"/>
@@ -1442,6 +2051,8 @@
       </w:r>
       <w:r>
         <w:rPr>
+          <w:b w:val="0"/>
+          <w:i w:val="0"/>
           <w:sz w:val="22"/>
         </w:rPr>
         <w:t>This is the most serious objection to a naive reading of the hypothesis. Enhanced DNA repair is not synonymous with tumour suppression: repair and damage-tolerance pathways can help damaged or premalignant cells survive insults that would otherwise eliminate them, and error-prone end-joining can itself generate the structural variants that drive transformation (Ceccaldi et al. 2016). The hypothesis concerns high-fidelity restoration of genome integrity specifically, and makes no claim about indiscriminate enhancement of repair activity or damage tolerance — which the model would represent not as a larger α but as a change in what repair does.</w:t>
@@ -1460,6 +2071,8 @@
       </w:r>
       <w:r>
         <w:rPr>
+          <w:b w:val="0"/>
+          <w:i w:val="0"/>
           <w:sz w:val="22"/>
         </w:rPr>
         <w:t>The form of μ(I) and its parameters were chosen for qualitative consistency with a bistable, hysteretic system, not fitted to measurements. The exact scaling result in Section 6 is an algebraic property of uniform multiplication, and the robustness analysis establishes only that the direction of the effect survives across a wide parameter range. Neither is a numerically validated biological prediction.</w:t>
@@ -1478,6 +2091,8 @@
       </w:r>
       <w:r>
         <w:rPr>
+          <w:b w:val="0"/>
+          <w:i w:val="0"/>
           <w:sz w:val="22"/>
         </w:rPr>
         <w:t>CIRBP is one of several traits co-occurring with the bowhead's body size, metabolic rate, cell number, cold adaptation and immune profile, and existing experiments do not establish its causal weight relative to these. Firsanov et al. (2025) present enhanced repair as an important contributor to the phenotype, not a complete explanation of it.</w:t>
@@ -1496,6 +2111,8 @@
       </w:r>
       <w:r>
         <w:rPr>
+          <w:b w:val="0"/>
+          <w:i w:val="0"/>
           <w:sz w:val="22"/>
         </w:rPr>
         <w:t>The elephant's barrier multiplication achieves low cancer incidence in a large, long-lived mammal without any repair-based tipping-point mechanism (Abegglen et al. 2015). Repair fidelity is best read as one viable system-level solution among several, not as the general answer to Peto's paradox.</w:t>
@@ -1514,6 +2131,8 @@
       </w:r>
       <w:r>
         <w:rPr>
+          <w:b w:val="0"/>
+          <w:i w:val="0"/>
           <w:sz w:val="22"/>
         </w:rPr>
         <w:t>The order parameter I has no established experimental counterpart. P3 and P4 presuppose that a collective-organisation phenotype can be measured in an organoid or tissue system with enough resolution to locate a threshold. Developing such a readout is a prerequisite for testing the model at the level where it makes its most specific claims.</w:t>
@@ -1609,6 +2228,7 @@
       </w:pPr>
       <w:r>
         <w:rPr>
+          <w:b w:val="0"/>
           <w:i w:val="0"/>
           <w:sz w:val="22"/>
         </w:rPr>
@@ -1622,6 +2242,7 @@
       </w:pPr>
       <w:r>
         <w:rPr>
+          <w:b w:val="0"/>
           <w:i w:val="0"/>
           <w:sz w:val="22"/>
         </w:rPr>
@@ -1635,6 +2256,7 @@
       </w:pPr>
       <w:r>
         <w:rPr>
+          <w:b w:val="0"/>
           <w:i w:val="0"/>
           <w:sz w:val="22"/>
         </w:rPr>
@@ -1659,6 +2281,7 @@
       </w:pPr>
       <w:r>
         <w:rPr>
+          <w:b w:val="0"/>
           <w:i w:val="0"/>
           <w:sz w:val="22"/>
         </w:rPr>
@@ -1683,6 +2306,7 @@
       </w:pPr>
       <w:r>
         <w:rPr>
+          <w:b w:val="0"/>
           <w:i w:val="0"/>
           <w:sz w:val="22"/>
         </w:rPr>
@@ -1695,6 +2319,7 @@
       </w:pPr>
       <w:r>
         <w:rPr>
+          <w:b w:val="0"/>
           <w:i w:val="0"/>
           <w:sz w:val="22"/>
         </w:rPr>
@@ -1707,6 +2332,7 @@
       </w:pPr>
       <w:r>
         <w:rPr>
+          <w:b w:val="0"/>
           <w:i w:val="0"/>
           <w:sz w:val="22"/>
         </w:rPr>
@@ -1719,6 +2345,7 @@
       </w:pPr>
       <w:r>
         <w:rPr>
+          <w:b w:val="0"/>
           <w:i w:val="0"/>
           <w:sz w:val="22"/>
         </w:rPr>

</xml_diff>